<commit_message>
Informe de mayo firmado
</commit_message>
<xml_diff>
--- a/1023630560, SAMUEL LÓPEZ, IA (3).docx
+++ b/1023630560, SAMUEL LÓPEZ, IA (3).docx
@@ -1014,7 +1014,7 @@
           <w:u w:val="single"/>
         </w:rPr>
         <w:drawing>
-          <wp:inline distT="0" distB="0" distL="0" distR="0" wp14:anchorId="7EF4A5F4" wp14:editId="4F68B4FD">
+          <wp:inline distT="0" distB="0" distL="0" distR="0" wp14:anchorId="7EF4A5F4" wp14:editId="604D900D">
             <wp:extent cx="1409700" cy="679496"/>
             <wp:effectExtent l="0" t="0" r="0" b="0"/>
             <wp:docPr id="1395513098" name="Imagen 1"/>
@@ -1114,6 +1114,56 @@
       <w:r>
         <w:rPr>
           <w:rFonts w:asciiTheme="minorHAnsi" w:hAnsiTheme="minorHAnsi" w:cstheme="minorHAnsi"/>
+          <w:noProof/>
+          <w:sz w:val="20"/>
+          <w:szCs w:val="20"/>
+          <w:u w:val="single"/>
+        </w:rPr>
+        <w:drawing>
+          <wp:inline distT="0" distB="0" distL="0" distR="0" wp14:anchorId="564160AA" wp14:editId="5249479F">
+            <wp:extent cx="1720574" cy="497737"/>
+            <wp:effectExtent l="0" t="0" r="0" b="0"/>
+            <wp:docPr id="1829977450" name="Imagen 1"/>
+            <wp:cNvGraphicFramePr>
+              <a:graphicFrameLocks xmlns:a="http://schemas.openxmlformats.org/drawingml/2006/main" noChangeAspect="1"/>
+            </wp:cNvGraphicFramePr>
+            <a:graphic xmlns:a="http://schemas.openxmlformats.org/drawingml/2006/main">
+              <a:graphicData uri="http://schemas.openxmlformats.org/drawingml/2006/picture">
+                <pic:pic xmlns:pic="http://schemas.openxmlformats.org/drawingml/2006/picture">
+                  <pic:nvPicPr>
+                    <pic:cNvPr id="1829977450" name="Imagen 1829977450"/>
+                    <pic:cNvPicPr/>
+                  </pic:nvPicPr>
+                  <pic:blipFill>
+                    <a:blip r:embed="rId10">
+                      <a:extLst>
+                        <a:ext uri="{28A0092B-C50C-407E-A947-70E740481C1C}">
+                          <a14:useLocalDpi xmlns:a14="http://schemas.microsoft.com/office/drawing/2010/main" val="0"/>
+                        </a:ext>
+                      </a:extLst>
+                    </a:blip>
+                    <a:stretch>
+                      <a:fillRect/>
+                    </a:stretch>
+                  </pic:blipFill>
+                  <pic:spPr>
+                    <a:xfrm>
+                      <a:off x="0" y="0"/>
+                      <a:ext cx="1858135" cy="537532"/>
+                    </a:xfrm>
+                    <a:prstGeom prst="rect">
+                      <a:avLst/>
+                    </a:prstGeom>
+                  </pic:spPr>
+                </pic:pic>
+              </a:graphicData>
+            </a:graphic>
+          </wp:inline>
+        </w:drawing>
+      </w:r>
+      <w:r>
+        <w:rPr>
+          <w:rFonts w:asciiTheme="minorHAnsi" w:hAnsiTheme="minorHAnsi" w:cstheme="minorHAnsi"/>
           <w:sz w:val="20"/>
           <w:szCs w:val="20"/>
           <w:u w:val="single"/>
@@ -1272,7 +1322,7 @@
       </w:pPr>
     </w:p>
     <w:sectPr>
-      <w:headerReference w:type="default" r:id="rId10"/>
+      <w:headerReference w:type="default" r:id="rId11"/>
       <w:pgSz w:w="12240" w:h="15840"/>
       <w:pgMar w:top="1701" w:right="1134" w:bottom="1701" w:left="1134" w:header="709" w:footer="709" w:gutter="0"/>
       <w:cols w:space="708"/>
@@ -2656,26 +2706,6 @@
 </file>
 
 <file path=customXml/item1.xml><?xml version="1.0" encoding="utf-8"?>
-<p:properties xmlns:p="http://schemas.microsoft.com/office/2006/metadata/properties" xmlns:xsi="http://www.w3.org/2001/XMLSchema-instance" xmlns:pc="http://schemas.microsoft.com/office/infopath/2007/PartnerControls">
-  <documentManagement>
-    <lcf76f155ced4ddcb4097134ff3c332f xmlns="15c23b83-0a74-4dd8-96fd-c1cdb1965e64">
-      <Terms xmlns="http://schemas.microsoft.com/office/infopath/2007/PartnerControls"/>
-    </lcf76f155ced4ddcb4097134ff3c332f>
-    <TaxCatchAll xmlns="a9d0ce2f-9ce2-4b22-8e2a-723aa410c551" xsi:nil="true"/>
-  </documentManagement>
-</p:properties>
-</file>
-
-<file path=customXml/item2.xml><?xml version="1.0" encoding="utf-8"?>
-<?mso-contentType ?>
-<FormTemplates xmlns="http://schemas.microsoft.com/sharepoint/v3/contenttype/forms">
-  <Display>DocumentLibraryForm</Display>
-  <Edit>DocumentLibraryForm</Edit>
-  <New>DocumentLibraryForm</New>
-</FormTemplates>
-</file>
-
-<file path=customXml/item3.xml><?xml version="1.0" encoding="utf-8"?>
 <ct:contentTypeSchema xmlns:ct="http://schemas.microsoft.com/office/2006/metadata/contentType" xmlns:ma="http://schemas.microsoft.com/office/2006/metadata/properties/metaAttributes" ct:_="" ma:_="" ma:contentTypeName="Documento" ma:contentTypeID="0x010100108846D5F9C3AE4C85EBCC6E9567D38C" ma:contentTypeVersion="13" ma:contentTypeDescription="Crear nuevo documento." ma:contentTypeScope="" ma:versionID="234bf719b0d5b04b273866643ddfa94d">
   <xsd:schema xmlns:xsd="http://www.w3.org/2001/XMLSchema" xmlns:xs="http://www.w3.org/2001/XMLSchema" xmlns:p="http://schemas.microsoft.com/office/2006/metadata/properties" xmlns:ns2="15c23b83-0a74-4dd8-96fd-c1cdb1965e64" xmlns:ns3="a9d0ce2f-9ce2-4b22-8e2a-723aa410c551" targetNamespace="http://schemas.microsoft.com/office/2006/metadata/properties" ma:root="true" ma:fieldsID="4d848263e9339a884436c6a48d27beb6" ns2:_="" ns3:_="">
     <xsd:import namespace="15c23b83-0a74-4dd8-96fd-c1cdb1965e64"/>
@@ -2882,26 +2912,27 @@
 </ct:contentTypeSchema>
 </file>
 
-<file path=customXml/itemProps1.xml><?xml version="1.0" encoding="utf-8"?>
-<ds:datastoreItem xmlns:ds="http://schemas.openxmlformats.org/officeDocument/2006/customXml" ds:itemID="{FAEC7C88-3BC7-46FB-A03C-FBCCEAD2F93D}">
-  <ds:schemaRefs>
-    <ds:schemaRef ds:uri="http://schemas.microsoft.com/office/2006/metadata/properties"/>
-    <ds:schemaRef ds:uri="http://schemas.microsoft.com/office/infopath/2007/PartnerControls"/>
-    <ds:schemaRef ds:uri="15c23b83-0a74-4dd8-96fd-c1cdb1965e64"/>
-    <ds:schemaRef ds:uri="a9d0ce2f-9ce2-4b22-8e2a-723aa410c551"/>
-  </ds:schemaRefs>
-</ds:datastoreItem>
+<file path=customXml/item2.xml><?xml version="1.0" encoding="utf-8"?>
+<?mso-contentType ?>
+<FormTemplates xmlns="http://schemas.microsoft.com/sharepoint/v3/contenttype/forms">
+  <Display>DocumentLibraryForm</Display>
+  <Edit>DocumentLibraryForm</Edit>
+  <New>DocumentLibraryForm</New>
+</FormTemplates>
 </file>
 
-<file path=customXml/itemProps2.xml><?xml version="1.0" encoding="utf-8"?>
-<ds:datastoreItem xmlns:ds="http://schemas.openxmlformats.org/officeDocument/2006/customXml" ds:itemID="{6E42620F-EA52-46A3-AF92-9188E2FB2822}">
-  <ds:schemaRefs>
-    <ds:schemaRef ds:uri="http://schemas.microsoft.com/sharepoint/v3/contenttype/forms"/>
-  </ds:schemaRefs>
-</ds:datastoreItem>
+<file path=customXml/item3.xml><?xml version="1.0" encoding="utf-8"?>
+<p:properties xmlns:p="http://schemas.microsoft.com/office/2006/metadata/properties" xmlns:xsi="http://www.w3.org/2001/XMLSchema-instance" xmlns:pc="http://schemas.microsoft.com/office/infopath/2007/PartnerControls">
+  <documentManagement>
+    <lcf76f155ced4ddcb4097134ff3c332f xmlns="15c23b83-0a74-4dd8-96fd-c1cdb1965e64">
+      <Terms xmlns="http://schemas.microsoft.com/office/infopath/2007/PartnerControls"/>
+    </lcf76f155ced4ddcb4097134ff3c332f>
+    <TaxCatchAll xmlns="a9d0ce2f-9ce2-4b22-8e2a-723aa410c551" xsi:nil="true"/>
+  </documentManagement>
+</p:properties>
 </file>
 
-<file path=customXml/itemProps3.xml><?xml version="1.0" encoding="utf-8"?>
+<file path=customXml/itemProps1.xml><?xml version="1.0" encoding="utf-8"?>
 <ds:datastoreItem xmlns:ds="http://schemas.openxmlformats.org/officeDocument/2006/customXml" ds:itemID="{A0AC0BCA-7724-4C8A-92DC-0D15359ECDC3}">
   <ds:schemaRefs>
     <ds:schemaRef ds:uri="http://schemas.microsoft.com/office/2006/metadata/contentType"/>
@@ -2918,4 +2949,23 @@
     <ds:schemaRef ds:uri="http://schemas.microsoft.com/internal/obd"/>
   </ds:schemaRefs>
 </ds:datastoreItem>
+</file>
+
+<file path=customXml/itemProps2.xml><?xml version="1.0" encoding="utf-8"?>
+<ds:datastoreItem xmlns:ds="http://schemas.openxmlformats.org/officeDocument/2006/customXml" ds:itemID="{6E42620F-EA52-46A3-AF92-9188E2FB2822}">
+  <ds:schemaRefs>
+    <ds:schemaRef ds:uri="http://schemas.microsoft.com/sharepoint/v3/contenttype/forms"/>
+  </ds:schemaRefs>
+</ds:datastoreItem>
+</file>
+
+<file path=customXml/itemProps3.xml><?xml version="1.0" encoding="utf-8"?>
+<ds:datastoreItem xmlns:ds="http://schemas.openxmlformats.org/officeDocument/2006/customXml" ds:itemID="{FAEC7C88-3BC7-46FB-A03C-FBCCEAD2F93D}">
+  <ds:schemaRefs>
+    <ds:schemaRef ds:uri="http://schemas.microsoft.com/office/2006/metadata/properties"/>
+    <ds:schemaRef ds:uri="http://schemas.microsoft.com/office/infopath/2007/PartnerControls"/>
+    <ds:schemaRef ds:uri="15c23b83-0a74-4dd8-96fd-c1cdb1965e64"/>
+    <ds:schemaRef ds:uri="a9d0ce2f-9ce2-4b22-8e2a-723aa410c551"/>
+  </ds:schemaRefs>
+</ds:datastoreItem>
 </file>
</xml_diff>